<commit_message>
Redesigned pitch deck (premium icons, denser layouts) and updated project description
Co-Authored-By: Claude Opus 5.5 <noreply@anthropic.com>
Claude-Session: https://claude.ai/code/session_01EaQK246aMQzwomPekpbjvp
</commit_message>
<xml_diff>
--- a/docs/submission/Sajag_AI_Brief_Project_Description.docx
+++ b/docs/submission/Sajag_AI_Brief_Project_Description.docx
@@ -226,7 +226,7 @@
         <w:rPr>
           <w:i w:val="0"/>
         </w:rPr>
-        <w:t>Sajag AI watches the three places a modern scam actually happens on a PC: the call audio (any app, via WASAPI loopback), the screen (OCR of fake warrants, scareware pop-ups and payment pages) and the system (remote-access tools such as AnyDesk starting during a call). Every model runs locally on the Snapdragon Hexagon NPU. A multilingual risk engine and a temporal, cross-modal fusion model turn those signals into a verdict (SAFE, CAUTION, WARNING, DANGER). When the risk crosses WARNING, Sajag interrupts the user with a full-screen bilingual card, a spoken warning, the exact reasons ("asked you to stay on the call and not tell anyone") and the national cyber-fraud helpline 1930. Nothing is uploaded and nothing is stored.</w:t>
+        <w:t>Sajag AI watches the three places a modern scam actually happens on a PC: the call audio (any app, via WASAPI loopback), the screen (OCR of fake warrants, scareware pop-ups and payment pages) and the system (remote-access tools such as AnyDesk starting during a call). Every model runs locally on the Snapdragon Hexagon NPU. A multilingual risk engine and a temporal, cross-modal fusion model turn those signals into a verdict (SAFE, CAUTION, WARNING, DANGER). When the risk crosses WARNING, Sajag interrupts the user with a full-screen bilingual card, a spoken warning, the exact reasons ("asked you to stay on the call and not tell anyone") and the national cyber-fraud helpline 1930. Nothing is uploaded and nothing is stored. After the call, one click turns the in-memory evidence into a golden-hour 1930 report (claimed identities, phone numbers, UPI IDs, account numbers, IFSC codes, amounts, links, remote-access apps and a timeline) so the victim can report quickly enough for banks to freeze the money.</w:t>
       </w:r>
     </w:p>
     <w:p>
@@ -240,7 +240,7 @@
         <w:rPr>
           <w:i w:val="0"/>
         </w:rPr>
-        <w:t>On a reproducible synthetic evaluation Sajag detects 91% of 200 scam calls with 0.5% false alarms on 200 benign calls (median 2 turns to the first warning), passes all 5 end-to-end scenarios, and 27 of 27 tests. In the digital-arrest scenario it raises a WARNING at 20 s and DANGER at 26 s, before the transfer request at 45 s.</w:t>
+        <w:t>On a reproducible synthetic evaluation Sajag detects 91% of 200 scam calls with 0.5% false alarms on 200 benign calls (median 2 turns to the first warning); on scam scripts the classifier never saw it detects 54% at 0.5% false alarms. It passes all 5 end-to-end scenarios and 29 of 29 tests. In the digital-arrest scenario it raises a WARNING at 20 s and DANGER at 26 s, before the transfer request at 45 s.</w:t>
       </w:r>
     </w:p>
     <w:p>
@@ -614,6 +614,50 @@
           </w:p>
         </w:tc>
       </w:tr>
+      <w:tr>
+        <w:tc>
+          <w:tcPr>
+            <w:tcW w:type="dxa" w:w="1872"/>
+          </w:tcPr>
+          <w:p>
+            <w:r/>
+            <w:r>
+              <w:rPr>
+                <w:sz w:val="16"/>
+              </w:rPr>
+              <w:t>Golden-hour 1930 report</w:t>
+            </w:r>
+          </w:p>
+        </w:tc>
+        <w:tc>
+          <w:tcPr>
+            <w:tcW w:type="dxa" w:w="6192"/>
+          </w:tcPr>
+          <w:p>
+            <w:r/>
+            <w:r>
+              <w:rPr>
+                <w:sz w:val="16"/>
+              </w:rPr>
+              <w:t>On request only: extracts claimed identities, phone numbers, UPI IDs, account numbers, IFSC codes, amounts, links and remote apps from call and screen evidence, with a timeline and next steps in English and Hindi</w:t>
+            </w:r>
+          </w:p>
+        </w:tc>
+        <w:tc>
+          <w:tcPr>
+            <w:tcW w:type="dxa" w:w="1728"/>
+          </w:tcPr>
+          <w:p>
+            <w:r/>
+            <w:r>
+              <w:rPr>
+                <w:sz w:val="16"/>
+              </w:rPr>
+              <w:t>CPU (milliseconds)</w:t>
+            </w:r>
+          </w:p>
+        </w:tc>
+      </w:tr>
     </w:tbl>
     <w:p>
       <w:pPr>
@@ -664,6 +708,52 @@
           <w:sz w:val="16"/>
         </w:rPr>
         <w:t>Figure 1. Sajag dashboard during the scripted digital-arrest scenario (CPU fallback on an x86 laptop; the same code uses the NPU on Snapdragon).</w:t>
+      </w:r>
+    </w:p>
+    <w:p>
+      <w:r>
+        <w:drawing>
+          <wp:inline xmlns:a="http://schemas.openxmlformats.org/drawingml/2006/main" xmlns:pic="http://schemas.openxmlformats.org/drawingml/2006/picture">
+            <wp:extent cx="5120640" cy="3058160"/>
+            <wp:docPr id="2" name="Picture 2"/>
+            <wp:cNvGraphicFramePr>
+              <a:graphicFrameLocks noChangeAspect="1"/>
+            </wp:cNvGraphicFramePr>
+            <a:graphic>
+              <a:graphicData uri="http://schemas.openxmlformats.org/drawingml/2006/picture">
+                <pic:pic>
+                  <pic:nvPicPr>
+                    <pic:cNvPr id="0" name="report_modal.png"/>
+                    <pic:cNvPicPr/>
+                  </pic:nvPicPr>
+                  <pic:blipFill>
+                    <a:blip r:embed="rId10"/>
+                    <a:stretch>
+                      <a:fillRect/>
+                    </a:stretch>
+                  </pic:blipFill>
+                  <pic:spPr>
+                    <a:xfrm>
+                      <a:off x="0" y="0"/>
+                      <a:ext cx="5120640" cy="3058160"/>
+                    </a:xfrm>
+                    <a:prstGeom prst="rect"/>
+                  </pic:spPr>
+                </pic:pic>
+              </a:graphicData>
+            </a:graphic>
+          </wp:inline>
+        </w:drawing>
+      </w:r>
+    </w:p>
+    <w:p>
+      <w:r>
+        <w:rPr>
+          <w:i/>
+          <w:color w:val="5E5E66"/>
+          <w:sz w:val="16"/>
+        </w:rPr>
+        <w:t>Figure 2. Golden-hour 1930 report generated from the same replay (demo data). Built only when the user clicks, never uploaded.</w:t>
       </w:r>
     </w:p>
     <w:p>
@@ -1679,6 +1769,68 @@
               <w:rPr>
                 <w:sz w:val="16"/>
               </w:rPr>
+              <w:t>Full pipeline on scam scripts the classifier never saw (25% of templates withheld)</w:t>
+            </w:r>
+          </w:p>
+        </w:tc>
+        <w:tc>
+          <w:tcPr>
+            <w:tcW w:type="dxa" w:w="6048"/>
+            <w:shd w:val="clear" w:color="auto" w:fill="F6F2EC"/>
+          </w:tcPr>
+          <w:p>
+            <w:r/>
+            <w:r>
+              <w:rPr>
+                <w:sz w:val="16"/>
+              </w:rPr>
+              <w:t>54% detected, 0.5% false alarms</w:t>
+            </w:r>
+          </w:p>
+        </w:tc>
+      </w:tr>
+      <w:tr>
+        <w:tc>
+          <w:tcPr>
+            <w:tcW w:type="dxa" w:w="3744"/>
+          </w:tcPr>
+          <w:p>
+            <w:r/>
+            <w:r>
+              <w:rPr>
+                <w:sz w:val="16"/>
+              </w:rPr>
+              <w:t>Golden-hour report</w:t>
+            </w:r>
+          </w:p>
+        </w:tc>
+        <w:tc>
+          <w:tcPr>
+            <w:tcW w:type="dxa" w:w="6048"/>
+          </w:tcPr>
+          <w:p>
+            <w:r/>
+            <w:r>
+              <w:rPr>
+                <w:sz w:val="16"/>
+              </w:rPr>
+              <w:t>extracts UPI IDs, phones, accounts, IFSC, amounts, links and remote apps; timeline ordered (unit tests)</w:t>
+            </w:r>
+          </w:p>
+        </w:tc>
+      </w:tr>
+      <w:tr>
+        <w:tc>
+          <w:tcPr>
+            <w:tcW w:type="dxa" w:w="3744"/>
+            <w:shd w:val="clear" w:color="auto" w:fill="F6F2EC"/>
+          </w:tcPr>
+          <w:p>
+            <w:r/>
+            <w:r>
+              <w:rPr>
+                <w:sz w:val="16"/>
+              </w:rPr>
               <w:t>Per family detection</w:t>
             </w:r>
           </w:p>
@@ -1756,7 +1908,7 @@
               <w:rPr>
                 <w:sz w:val="16"/>
               </w:rPr>
-              <w:t>27 / 27 pass (python -m pytest)</w:t>
+              <w:t>29 / 29 pass (python -m pytest); CI runs tests, demo replay and evaluation on every push</w:t>
             </w:r>
           </w:p>
         </w:tc>
@@ -1804,7 +1956,7 @@
           <w:color w:val="5E5E66"/>
           <w:sz w:val="18"/>
         </w:rPr>
-        <w:t>Honest limitations: the corpus is synthetic and its templates overlap the training data, so these figures are an upper bound; validation on consented real-call recordings is the first roadmap item. NPU latencies are quoted from Qualcomm AI Hub profiles; python -m sajag bench measures them on the device.</w:t>
+        <w:t>Honest limitations: the corpus is synthetic; the 91% figure uses templates that overlap the training data and is an upper bound, while the held-out figure is the honest lower estimate for brand-new scripts; validation on consented real-call recordings is the first roadmap item. NPU latencies are quoted from Qualcomm AI Hub profiles; python -m sajag bench measures them on the device.</w:t>
       </w:r>
     </w:p>
     <w:p>

</xml_diff>